<commit_message>
Fix title page formatting and convert essay to PDF
Co-authored-by: marsupiter43-collab <253706942+marsupiter43-collab@users.noreply.github.com>
</commit_message>
<xml_diff>
--- a/Реферат_Спорт_и_нормы.docx
+++ b/Реферат_Спорт_и_нормы.docx
@@ -3,7 +3,6 @@
 <w:document xmlns:wpc="http://schemas.microsoft.com/office/word/2010/wordprocessingCanvas" xmlns:mo="http://schemas.microsoft.com/office/mac/office/2008/main" xmlns:mc="http://schemas.openxmlformats.org/markup-compatibility/2006" xmlns:mv="urn:schemas-microsoft-com:mac:vml" xmlns:o="urn:schemas-microsoft-com:office:office" xmlns:r="http://schemas.openxmlformats.org/officeDocument/2006/relationships" xmlns:m="http://schemas.openxmlformats.org/officeDocument/2006/math" xmlns:v="urn:schemas-microsoft-com:vml" xmlns:wp14="http://schemas.microsoft.com/office/word/2010/wordprocessingDrawing" xmlns:wp="http://schemas.openxmlformats.org/drawingml/2006/wordprocessingDrawing" xmlns:w10="urn:schemas-microsoft-com:office:word" xmlns:w="http://schemas.openxmlformats.org/wordprocessingml/2006/main" xmlns:w14="http://schemas.microsoft.com/office/word/2010/wordml" xmlns:wpg="http://schemas.microsoft.com/office/word/2010/wordprocessingGroup" xmlns:wpi="http://schemas.microsoft.com/office/word/2010/wordprocessingInk" xmlns:wne="http://schemas.microsoft.com/office/word/2006/wordml" xmlns:wps="http://schemas.microsoft.com/office/word/2010/wordprocessingShape" mc:Ignorable="w14 wp14">
   <w:body>
     <w:p/>
-    <w:p/>
     <w:p>
       <w:pPr>
         <w:jc w:val="center"/>
@@ -20,8 +19,6 @@
         <w:t>Учалинский горный колледж (УКГП)</w:t>
       </w:r>
     </w:p>
-    <w:p/>
-    <w:p/>
     <w:p/>
     <w:p/>
     <w:p/>
@@ -63,9 +60,6 @@
     <w:p/>
     <w:p/>
     <w:p/>
-    <w:p/>
-    <w:p/>
-    <w:p/>
     <w:p>
       <w:pPr>
         <w:jc w:val="center"/>
@@ -107,8 +101,22 @@
         <w:t>преподаватель Заботина С.Р.</w:t>
       </w:r>
     </w:p>
-    <w:p/>
-    <w:p/>
+    <w:p>
+      <w:pPr>
+        <w:jc w:val="center"/>
+      </w:pPr>
+      <w:r>
+        <w:t>Оценка: _____________</w:t>
+      </w:r>
+    </w:p>
+    <w:p>
+      <w:pPr>
+        <w:jc w:val="center"/>
+      </w:pPr>
+      <w:r>
+        <w:t>Подпись: _____________</w:t>
+      </w:r>
+    </w:p>
     <w:p/>
     <w:p/>
     <w:p/>

</xml_diff>

<commit_message>
Fix formatting and finalize essay on Sport and Norms
Co-authored-by: marsupiter43-collab <253706942+marsupiter43-collab@users.noreply.github.com>
</commit_message>
<xml_diff>
--- a/Реферат_Спорт_и_нормы.docx
+++ b/Реферат_Спорт_и_нормы.docx
@@ -2,28 +2,92 @@
 <file path=word/document.xml><?xml version="1.0" encoding="utf-8"?>
 <w:document xmlns:wpc="http://schemas.microsoft.com/office/word/2010/wordprocessingCanvas" xmlns:mo="http://schemas.microsoft.com/office/mac/office/2008/main" xmlns:mc="http://schemas.openxmlformats.org/markup-compatibility/2006" xmlns:mv="urn:schemas-microsoft-com:mac:vml" xmlns:o="urn:schemas-microsoft-com:office:office" xmlns:r="http://schemas.openxmlformats.org/officeDocument/2006/relationships" xmlns:m="http://schemas.openxmlformats.org/officeDocument/2006/math" xmlns:v="urn:schemas-microsoft-com:vml" xmlns:wp14="http://schemas.microsoft.com/office/word/2010/wordprocessingDrawing" xmlns:wp="http://schemas.openxmlformats.org/drawingml/2006/wordprocessingDrawing" xmlns:w10="urn:schemas-microsoft-com:office:word" xmlns:w="http://schemas.openxmlformats.org/wordprocessingml/2006/main" xmlns:w14="http://schemas.microsoft.com/office/word/2010/wordml" xmlns:wpg="http://schemas.microsoft.com/office/word/2010/wordprocessingGroup" xmlns:wpi="http://schemas.microsoft.com/office/word/2010/wordprocessingInk" xmlns:wne="http://schemas.microsoft.com/office/word/2006/wordml" xmlns:wps="http://schemas.microsoft.com/office/word/2010/wordprocessingShape" mc:Ignorable="w14 wp14">
   <w:body>
-    <w:p/>
     <w:p>
       <w:pPr>
+        <w:spacing w:after="0" w:before="0" w:line="240" w:lineRule="auto"/>
+        <w:ind w:firstLine="0"/>
         <w:jc w:val="center"/>
       </w:pPr>
       <w:r>
+        <w:rPr>
+          <w:sz w:val="28"/>
+        </w:rPr>
         <w:t>МИНИСТЕРСТВО ОБРАЗОВАНИЯ И НАУКИ</w:t>
       </w:r>
     </w:p>
     <w:p>
       <w:pPr>
+        <w:spacing w:after="0" w:before="0" w:line="240" w:lineRule="auto"/>
+        <w:ind w:firstLine="0"/>
         <w:jc w:val="center"/>
       </w:pPr>
       <w:r>
+        <w:rPr>
+          <w:sz w:val="28"/>
+        </w:rPr>
         <w:t>Учалинский горный колледж (УКГП)</w:t>
       </w:r>
     </w:p>
-    <w:p/>
-    <w:p/>
-    <w:p/>
     <w:p>
       <w:pPr>
+        <w:spacing w:after="0" w:before="0" w:line="240" w:lineRule="auto"/>
+        <w:ind w:firstLine="0"/>
+        <w:jc w:val="center"/>
+      </w:pPr>
+    </w:p>
+    <w:p>
+      <w:pPr>
+        <w:spacing w:after="0" w:before="0" w:line="240" w:lineRule="auto"/>
+        <w:ind w:firstLine="0"/>
+        <w:jc w:val="center"/>
+      </w:pPr>
+    </w:p>
+    <w:p>
+      <w:pPr>
+        <w:spacing w:after="0" w:before="0" w:line="240" w:lineRule="auto"/>
+        <w:ind w:firstLine="0"/>
+        <w:jc w:val="center"/>
+      </w:pPr>
+    </w:p>
+    <w:p>
+      <w:pPr>
+        <w:spacing w:after="0" w:before="0" w:line="240" w:lineRule="auto"/>
+        <w:ind w:firstLine="0"/>
+        <w:jc w:val="center"/>
+      </w:pPr>
+    </w:p>
+    <w:p>
+      <w:pPr>
+        <w:spacing w:after="0" w:before="0" w:line="240" w:lineRule="auto"/>
+        <w:ind w:firstLine="0"/>
+        <w:jc w:val="center"/>
+      </w:pPr>
+    </w:p>
+    <w:p>
+      <w:pPr>
+        <w:spacing w:after="0" w:before="0" w:line="240" w:lineRule="auto"/>
+        <w:ind w:firstLine="0"/>
+        <w:jc w:val="center"/>
+      </w:pPr>
+    </w:p>
+    <w:p>
+      <w:pPr>
+        <w:spacing w:after="0" w:before="0" w:line="240" w:lineRule="auto"/>
+        <w:ind w:firstLine="0"/>
+        <w:jc w:val="center"/>
+      </w:pPr>
+    </w:p>
+    <w:p>
+      <w:pPr>
+        <w:spacing w:after="0" w:before="0" w:line="240" w:lineRule="auto"/>
+        <w:ind w:firstLine="0"/>
+        <w:jc w:val="center"/>
+      </w:pPr>
+    </w:p>
+    <w:p>
+      <w:pPr>
+        <w:spacing w:after="0" w:before="0" w:line="240" w:lineRule="auto"/>
+        <w:ind w:firstLine="0"/>
         <w:jc w:val="center"/>
       </w:pPr>
       <w:r>
@@ -36,15 +100,28 @@
     </w:p>
     <w:p>
       <w:pPr>
+        <w:spacing w:after="0" w:before="0" w:line="240" w:lineRule="auto"/>
+        <w:ind w:firstLine="0"/>
         <w:jc w:val="center"/>
       </w:pPr>
       <w:r>
+        <w:rPr>
+          <w:sz w:val="28"/>
+        </w:rPr>
         <w:t>По дисциплине: Физическая культура</w:t>
       </w:r>
     </w:p>
-    <w:p/>
     <w:p>
       <w:pPr>
+        <w:spacing w:after="0" w:before="0" w:line="240" w:lineRule="auto"/>
+        <w:ind w:firstLine="0"/>
+        <w:jc w:val="center"/>
+      </w:pPr>
+    </w:p>
+    <w:p>
+      <w:pPr>
+        <w:spacing w:after="0" w:before="0" w:line="240" w:lineRule="auto"/>
+        <w:ind w:firstLine="0"/>
         <w:jc w:val="center"/>
       </w:pPr>
       <w:r>
@@ -55,76 +132,200 @@
         <w:t>На тему: «Спорт и нормы»</w:t>
       </w:r>
     </w:p>
-    <w:p/>
-    <w:p/>
-    <w:p/>
-    <w:p/>
-    <w:p/>
     <w:p>
       <w:pPr>
+        <w:spacing w:after="0" w:before="0" w:line="240" w:lineRule="auto"/>
+        <w:ind w:firstLine="0"/>
         <w:jc w:val="center"/>
       </w:pPr>
+    </w:p>
+    <w:p>
+      <w:pPr>
+        <w:spacing w:after="0" w:before="0" w:line="240" w:lineRule="auto"/>
+        <w:ind w:firstLine="0"/>
+        <w:jc w:val="center"/>
+      </w:pPr>
+    </w:p>
+    <w:p>
+      <w:pPr>
+        <w:spacing w:after="0" w:before="0" w:line="240" w:lineRule="auto"/>
+        <w:ind w:firstLine="0"/>
+        <w:jc w:val="center"/>
+      </w:pPr>
+    </w:p>
+    <w:p>
+      <w:pPr>
+        <w:spacing w:after="0" w:before="0" w:line="240" w:lineRule="auto"/>
+        <w:ind w:firstLine="0"/>
+        <w:jc w:val="center"/>
+      </w:pPr>
+    </w:p>
+    <w:p>
+      <w:pPr>
+        <w:spacing w:after="0" w:before="0" w:line="240" w:lineRule="auto"/>
+        <w:ind w:firstLine="0"/>
+        <w:jc w:val="center"/>
+      </w:pPr>
+    </w:p>
+    <w:p>
+      <w:pPr>
+        <w:spacing w:after="0" w:before="0" w:line="240" w:lineRule="auto"/>
+        <w:ind w:firstLine="0"/>
+        <w:jc w:val="center"/>
+      </w:pPr>
+    </w:p>
+    <w:p>
+      <w:pPr>
+        <w:spacing w:after="0" w:before="0" w:line="240" w:lineRule="auto"/>
+        <w:ind w:firstLine="0"/>
+        <w:jc w:val="center"/>
+      </w:pPr>
+    </w:p>
+    <w:p>
+      <w:pPr>
+        <w:spacing w:after="0" w:before="0" w:line="240" w:lineRule="auto"/>
+        <w:ind w:firstLine="0"/>
+        <w:jc w:val="center"/>
+      </w:pPr>
+    </w:p>
+    <w:p>
+      <w:pPr>
+        <w:spacing w:after="0" w:before="0" w:line="240" w:lineRule="auto"/>
+        <w:ind w:firstLine="0"/>
+        <w:jc w:val="center"/>
+      </w:pPr>
       <w:r>
+        <w:rPr>
+          <w:sz w:val="28"/>
+        </w:rPr>
         <w:t>Выполнил:</w:t>
       </w:r>
     </w:p>
     <w:p>
       <w:pPr>
+        <w:spacing w:after="0" w:before="0" w:line="240" w:lineRule="auto"/>
+        <w:ind w:firstLine="0"/>
         <w:jc w:val="center"/>
       </w:pPr>
       <w:r>
+        <w:rPr>
+          <w:sz w:val="28"/>
+        </w:rPr>
         <w:t>студент 1 курса, группы РиУП-26</w:t>
       </w:r>
     </w:p>
     <w:p>
       <w:pPr>
+        <w:spacing w:after="0" w:before="0" w:line="240" w:lineRule="auto"/>
+        <w:ind w:firstLine="0"/>
         <w:jc w:val="center"/>
       </w:pPr>
       <w:r>
+        <w:rPr>
+          <w:sz w:val="28"/>
+        </w:rPr>
         <w:t>Юсупов Камиль Ильдарович</w:t>
       </w:r>
     </w:p>
-    <w:p/>
     <w:p>
       <w:pPr>
+        <w:spacing w:after="0" w:before="0" w:line="240" w:lineRule="auto"/>
+        <w:ind w:firstLine="0"/>
         <w:jc w:val="center"/>
       </w:pPr>
+    </w:p>
+    <w:p>
+      <w:pPr>
+        <w:spacing w:after="0" w:before="0" w:line="240" w:lineRule="auto"/>
+        <w:ind w:firstLine="0"/>
+        <w:jc w:val="center"/>
+      </w:pPr>
       <w:r>
-        <w:t>Проверил(а):</w:t>
+        <w:rPr>
+          <w:sz w:val="28"/>
+        </w:rPr>
+        <w:t>Руководитель:</w:t>
       </w:r>
     </w:p>
     <w:p>
       <w:pPr>
+        <w:spacing w:after="0" w:before="0" w:line="240" w:lineRule="auto"/>
+        <w:ind w:firstLine="0"/>
         <w:jc w:val="center"/>
       </w:pPr>
       <w:r>
+        <w:rPr>
+          <w:sz w:val="28"/>
+        </w:rPr>
         <w:t>преподаватель Заботина С.Р.</w:t>
       </w:r>
     </w:p>
     <w:p>
       <w:pPr>
+        <w:spacing w:after="0" w:before="0" w:line="240" w:lineRule="auto"/>
+        <w:ind w:firstLine="0"/>
         <w:jc w:val="center"/>
       </w:pPr>
-      <w:r>
-        <w:t>Оценка: _____________</w:t>
-      </w:r>
     </w:p>
     <w:p>
       <w:pPr>
+        <w:spacing w:after="0" w:before="0" w:line="240" w:lineRule="auto"/>
+        <w:ind w:firstLine="0"/>
         <w:jc w:val="center"/>
       </w:pPr>
+    </w:p>
+    <w:p>
+      <w:pPr>
+        <w:spacing w:after="0" w:before="0" w:line="240" w:lineRule="auto"/>
+        <w:ind w:firstLine="0"/>
+        <w:jc w:val="center"/>
+      </w:pPr>
+    </w:p>
+    <w:p>
+      <w:pPr>
+        <w:spacing w:after="0" w:before="0" w:line="240" w:lineRule="auto"/>
+        <w:ind w:firstLine="0"/>
+        <w:jc w:val="center"/>
+      </w:pPr>
+    </w:p>
+    <w:p>
+      <w:pPr>
+        <w:spacing w:after="0" w:before="0" w:line="240" w:lineRule="auto"/>
+        <w:ind w:firstLine="0"/>
+        <w:jc w:val="center"/>
+      </w:pPr>
+    </w:p>
+    <w:p>
+      <w:pPr>
+        <w:spacing w:after="0" w:before="0" w:line="240" w:lineRule="auto"/>
+        <w:ind w:firstLine="0"/>
+        <w:jc w:val="center"/>
+      </w:pPr>
+    </w:p>
+    <w:p>
+      <w:pPr>
+        <w:spacing w:after="0" w:before="0" w:line="240" w:lineRule="auto"/>
+        <w:ind w:firstLine="0"/>
+        <w:jc w:val="center"/>
+      </w:pPr>
+    </w:p>
+    <w:p>
+      <w:pPr>
+        <w:spacing w:after="0" w:before="0" w:line="240" w:lineRule="auto"/>
+        <w:ind w:firstLine="0"/>
+        <w:jc w:val="center"/>
+      </w:pPr>
+    </w:p>
+    <w:p>
+      <w:pPr>
+        <w:spacing w:after="0" w:before="0" w:line="240" w:lineRule="auto"/>
+        <w:ind w:firstLine="0"/>
+        <w:jc w:val="center"/>
+      </w:pPr>
       <w:r>
-        <w:t>Подпись: _____________</w:t>
-      </w:r>
-    </w:p>
-    <w:p/>
-    <w:p/>
-    <w:p/>
-    <w:p>
-      <w:pPr>
-        <w:jc w:val="center"/>
-      </w:pPr>
-      <w:r>
+        <w:rPr>
+          <w:sz w:val="28"/>
+        </w:rPr>
         <w:t>Учалы – 2026</w:t>
       </w:r>
     </w:p>
@@ -135,7 +336,7 @@
     </w:p>
     <w:p>
       <w:pPr>
-        <w:spacing w:after="280"/>
+        <w:spacing w:after="280" w:line="360" w:lineRule="auto"/>
         <w:ind w:firstLine="0"/>
         <w:jc w:val="center"/>
       </w:pPr>
@@ -148,7 +349,7 @@
     </w:p>
     <w:p>
       <w:pPr>
-        <w:spacing w:after="0"/>
+        <w:spacing w:after="0" w:line="360" w:lineRule="auto"/>
         <w:ind w:firstLine="709"/>
         <w:jc w:val="both"/>
       </w:pPr>
@@ -158,7 +359,7 @@
     </w:p>
     <w:p>
       <w:pPr>
-        <w:spacing w:after="0"/>
+        <w:spacing w:after="0" w:line="360" w:lineRule="auto"/>
         <w:ind w:firstLine="709"/>
         <w:jc w:val="both"/>
       </w:pPr>
@@ -168,7 +369,7 @@
     </w:p>
     <w:p>
       <w:pPr>
-        <w:spacing w:after="0"/>
+        <w:spacing w:after="0" w:line="360" w:lineRule="auto"/>
         <w:ind w:firstLine="709"/>
         <w:jc w:val="both"/>
       </w:pPr>
@@ -178,7 +379,7 @@
     </w:p>
     <w:p>
       <w:pPr>
-        <w:spacing w:after="0"/>
+        <w:spacing w:after="0" w:line="360" w:lineRule="auto"/>
         <w:ind w:firstLine="709"/>
         <w:jc w:val="both"/>
       </w:pPr>
@@ -188,7 +389,7 @@
     </w:p>
     <w:p>
       <w:pPr>
-        <w:spacing w:after="280"/>
+        <w:spacing w:after="280" w:line="360" w:lineRule="auto"/>
         <w:ind w:firstLine="0"/>
         <w:jc w:val="center"/>
       </w:pPr>
@@ -201,7 +402,7 @@
     </w:p>
     <w:p>
       <w:pPr>
-        <w:spacing w:after="280"/>
+        <w:spacing w:after="280" w:line="360" w:lineRule="auto"/>
         <w:ind w:firstLine="0"/>
         <w:jc w:val="center"/>
       </w:pPr>
@@ -214,7 +415,7 @@
     </w:p>
     <w:p>
       <w:pPr>
-        <w:spacing w:after="0"/>
+        <w:spacing w:after="0" w:line="360" w:lineRule="auto"/>
         <w:ind w:firstLine="709"/>
         <w:jc w:val="both"/>
       </w:pPr>
@@ -224,7 +425,7 @@
     </w:p>
     <w:p>
       <w:pPr>
-        <w:spacing w:after="0"/>
+        <w:spacing w:after="0" w:line="360" w:lineRule="auto"/>
         <w:ind w:firstLine="709"/>
         <w:jc w:val="both"/>
       </w:pPr>
@@ -234,7 +435,7 @@
     </w:p>
     <w:p>
       <w:pPr>
-        <w:spacing w:after="0"/>
+        <w:spacing w:after="0" w:line="360" w:lineRule="auto"/>
         <w:ind w:firstLine="709"/>
         <w:jc w:val="both"/>
       </w:pPr>
@@ -244,7 +445,7 @@
     </w:p>
     <w:p>
       <w:pPr>
-        <w:spacing w:after="280"/>
+        <w:spacing w:after="280" w:line="360" w:lineRule="auto"/>
         <w:ind w:firstLine="0"/>
         <w:jc w:val="center"/>
       </w:pPr>
@@ -257,7 +458,7 @@
     </w:p>
     <w:p>
       <w:pPr>
-        <w:spacing w:after="0"/>
+        <w:spacing w:after="0" w:line="360" w:lineRule="auto"/>
         <w:ind w:firstLine="709"/>
         <w:jc w:val="both"/>
       </w:pPr>
@@ -267,7 +468,7 @@
     </w:p>
     <w:p>
       <w:pPr>
-        <w:spacing w:after="0"/>
+        <w:spacing w:after="0" w:line="360" w:lineRule="auto"/>
         <w:ind w:firstLine="709"/>
         <w:jc w:val="both"/>
       </w:pPr>
@@ -277,7 +478,7 @@
     </w:p>
     <w:p>
       <w:pPr>
-        <w:spacing w:after="0"/>
+        <w:spacing w:after="0" w:line="360" w:lineRule="auto"/>
         <w:ind w:firstLine="709"/>
         <w:jc w:val="both"/>
       </w:pPr>
@@ -287,7 +488,7 @@
     </w:p>
     <w:p>
       <w:pPr>
-        <w:spacing w:after="280"/>
+        <w:spacing w:after="280" w:line="360" w:lineRule="auto"/>
         <w:ind w:firstLine="0"/>
         <w:jc w:val="center"/>
       </w:pPr>
@@ -300,7 +501,7 @@
     </w:p>
     <w:p>
       <w:pPr>
-        <w:spacing w:after="0"/>
+        <w:spacing w:after="0" w:line="360" w:lineRule="auto"/>
         <w:ind w:firstLine="709"/>
         <w:jc w:val="both"/>
       </w:pPr>
@@ -310,7 +511,7 @@
     </w:p>
     <w:p>
       <w:pPr>
-        <w:spacing w:after="0"/>
+        <w:spacing w:after="0" w:line="360" w:lineRule="auto"/>
         <w:ind w:firstLine="709"/>
         <w:jc w:val="both"/>
       </w:pPr>
@@ -320,7 +521,7 @@
     </w:p>
     <w:p>
       <w:pPr>
-        <w:spacing w:after="280"/>
+        <w:spacing w:after="280" w:line="360" w:lineRule="auto"/>
         <w:ind w:firstLine="0"/>
         <w:jc w:val="center"/>
       </w:pPr>
@@ -333,7 +534,7 @@
     </w:p>
     <w:p>
       <w:pPr>
-        <w:spacing w:after="0"/>
+        <w:spacing w:after="0" w:line="360" w:lineRule="auto"/>
         <w:ind w:firstLine="709"/>
         <w:jc w:val="both"/>
       </w:pPr>
@@ -343,7 +544,7 @@
     </w:p>
     <w:p>
       <w:pPr>
-        <w:spacing w:after="0"/>
+        <w:spacing w:after="0" w:line="360" w:lineRule="auto"/>
         <w:ind w:firstLine="709"/>
         <w:jc w:val="both"/>
       </w:pPr>
@@ -353,7 +554,7 @@
     </w:p>
     <w:p>
       <w:pPr>
-        <w:spacing w:after="0"/>
+        <w:spacing w:after="0" w:line="360" w:lineRule="auto"/>
         <w:ind w:firstLine="709"/>
         <w:jc w:val="both"/>
       </w:pPr>
@@ -363,7 +564,7 @@
     </w:p>
     <w:p>
       <w:pPr>
-        <w:spacing w:after="0"/>
+        <w:spacing w:after="0" w:line="360" w:lineRule="auto"/>
         <w:ind w:firstLine="709"/>
         <w:jc w:val="both"/>
       </w:pPr>
@@ -373,7 +574,7 @@
     </w:p>
     <w:p>
       <w:pPr>
-        <w:spacing w:after="0"/>
+        <w:spacing w:after="0" w:line="360" w:lineRule="auto"/>
         <w:ind w:firstLine="709"/>
         <w:jc w:val="both"/>
       </w:pPr>
@@ -383,7 +584,7 @@
     </w:p>
     <w:p>
       <w:pPr>
-        <w:spacing w:after="0"/>
+        <w:spacing w:after="0" w:line="360" w:lineRule="auto"/>
         <w:ind w:firstLine="709"/>
         <w:jc w:val="both"/>
       </w:pPr>
@@ -393,7 +594,7 @@
     </w:p>
     <w:p>
       <w:pPr>
-        <w:spacing w:after="280"/>
+        <w:spacing w:after="280" w:line="360" w:lineRule="auto"/>
         <w:ind w:firstLine="0"/>
         <w:jc w:val="center"/>
       </w:pPr>
@@ -406,7 +607,7 @@
     </w:p>
     <w:p>
       <w:pPr>
-        <w:spacing w:after="280"/>
+        <w:spacing w:after="280" w:line="360" w:lineRule="auto"/>
         <w:ind w:firstLine="0"/>
         <w:jc w:val="center"/>
       </w:pPr>
@@ -419,7 +620,7 @@
     </w:p>
     <w:p>
       <w:pPr>
-        <w:spacing w:after="0"/>
+        <w:spacing w:after="0" w:line="360" w:lineRule="auto"/>
         <w:ind w:firstLine="709"/>
         <w:jc w:val="both"/>
       </w:pPr>
@@ -429,7 +630,7 @@
     </w:p>
     <w:p>
       <w:pPr>
-        <w:spacing w:after="0"/>
+        <w:spacing w:after="0" w:line="360" w:lineRule="auto"/>
         <w:ind w:firstLine="709"/>
         <w:jc w:val="both"/>
       </w:pPr>
@@ -439,7 +640,7 @@
     </w:p>
     <w:p>
       <w:pPr>
-        <w:spacing w:after="0"/>
+        <w:spacing w:after="0" w:line="360" w:lineRule="auto"/>
         <w:ind w:firstLine="709"/>
         <w:jc w:val="both"/>
       </w:pPr>
@@ -449,7 +650,7 @@
     </w:p>
     <w:p>
       <w:pPr>
-        <w:spacing w:after="280"/>
+        <w:spacing w:after="280" w:line="360" w:lineRule="auto"/>
         <w:ind w:firstLine="0"/>
         <w:jc w:val="center"/>
       </w:pPr>
@@ -462,7 +663,7 @@
     </w:p>
     <w:p>
       <w:pPr>
-        <w:spacing w:after="0"/>
+        <w:spacing w:after="0" w:line="360" w:lineRule="auto"/>
         <w:ind w:firstLine="709"/>
         <w:jc w:val="both"/>
       </w:pPr>
@@ -472,7 +673,7 @@
     </w:p>
     <w:p>
       <w:pPr>
-        <w:spacing w:after="0"/>
+        <w:spacing w:after="0" w:line="360" w:lineRule="auto"/>
         <w:ind w:firstLine="709"/>
         <w:jc w:val="both"/>
       </w:pPr>
@@ -482,7 +683,7 @@
     </w:p>
     <w:p>
       <w:pPr>
-        <w:spacing w:after="0"/>
+        <w:spacing w:after="0" w:line="360" w:lineRule="auto"/>
         <w:ind w:firstLine="709"/>
         <w:jc w:val="both"/>
       </w:pPr>
@@ -492,7 +693,7 @@
     </w:p>
     <w:p>
       <w:pPr>
-        <w:spacing w:after="280"/>
+        <w:spacing w:after="280" w:line="360" w:lineRule="auto"/>
         <w:ind w:firstLine="0"/>
         <w:jc w:val="center"/>
       </w:pPr>
@@ -505,7 +706,7 @@
     </w:p>
     <w:p>
       <w:pPr>
-        <w:spacing w:after="280"/>
+        <w:spacing w:after="280" w:line="360" w:lineRule="auto"/>
         <w:ind w:firstLine="0"/>
         <w:jc w:val="center"/>
       </w:pPr>
@@ -518,7 +719,7 @@
     </w:p>
     <w:p>
       <w:pPr>
-        <w:spacing w:after="0"/>
+        <w:spacing w:after="0" w:line="360" w:lineRule="auto"/>
         <w:ind w:firstLine="709"/>
         <w:jc w:val="both"/>
       </w:pPr>
@@ -528,7 +729,7 @@
     </w:p>
     <w:p>
       <w:pPr>
-        <w:spacing w:after="0"/>
+        <w:spacing w:after="0" w:line="360" w:lineRule="auto"/>
         <w:ind w:firstLine="709"/>
         <w:jc w:val="both"/>
       </w:pPr>
@@ -538,7 +739,7 @@
     </w:p>
     <w:p>
       <w:pPr>
-        <w:spacing w:after="0"/>
+        <w:spacing w:after="0" w:line="360" w:lineRule="auto"/>
         <w:ind w:firstLine="709"/>
         <w:jc w:val="both"/>
       </w:pPr>
@@ -548,7 +749,7 @@
     </w:p>
     <w:p>
       <w:pPr>
-        <w:spacing w:after="280"/>
+        <w:spacing w:after="280" w:line="360" w:lineRule="auto"/>
         <w:ind w:firstLine="0"/>
         <w:jc w:val="center"/>
       </w:pPr>
@@ -561,7 +762,7 @@
     </w:p>
     <w:p>
       <w:pPr>
-        <w:spacing w:after="0"/>
+        <w:spacing w:after="0" w:line="360" w:lineRule="auto"/>
         <w:ind w:firstLine="709"/>
         <w:jc w:val="both"/>
       </w:pPr>
@@ -571,7 +772,7 @@
     </w:p>
     <w:p>
       <w:pPr>
-        <w:spacing w:after="0"/>
+        <w:spacing w:after="0" w:line="360" w:lineRule="auto"/>
         <w:ind w:firstLine="709"/>
         <w:jc w:val="both"/>
       </w:pPr>
@@ -581,7 +782,7 @@
     </w:p>
     <w:p>
       <w:pPr>
-        <w:spacing w:after="0"/>
+        <w:spacing w:after="0" w:line="360" w:lineRule="auto"/>
         <w:ind w:firstLine="709"/>
         <w:jc w:val="both"/>
       </w:pPr>
@@ -591,7 +792,7 @@
     </w:p>
     <w:p>
       <w:pPr>
-        <w:spacing w:after="280"/>
+        <w:spacing w:after="280" w:line="360" w:lineRule="auto"/>
         <w:ind w:firstLine="0"/>
         <w:jc w:val="center"/>
       </w:pPr>
@@ -604,7 +805,7 @@
     </w:p>
     <w:p>
       <w:pPr>
-        <w:spacing w:after="280"/>
+        <w:spacing w:after="280" w:line="360" w:lineRule="auto"/>
         <w:ind w:firstLine="0"/>
         <w:jc w:val="center"/>
       </w:pPr>
@@ -617,7 +818,7 @@
     </w:p>
     <w:p>
       <w:pPr>
-        <w:spacing w:after="0"/>
+        <w:spacing w:after="0" w:line="360" w:lineRule="auto"/>
         <w:ind w:firstLine="709"/>
         <w:jc w:val="both"/>
       </w:pPr>
@@ -627,7 +828,7 @@
     </w:p>
     <w:p>
       <w:pPr>
-        <w:spacing w:after="0"/>
+        <w:spacing w:after="0" w:line="360" w:lineRule="auto"/>
         <w:ind w:firstLine="709"/>
         <w:jc w:val="both"/>
       </w:pPr>
@@ -637,7 +838,7 @@
     </w:p>
     <w:p>
       <w:pPr>
-        <w:spacing w:after="0"/>
+        <w:spacing w:after="0" w:line="360" w:lineRule="auto"/>
         <w:ind w:firstLine="709"/>
         <w:jc w:val="both"/>
       </w:pPr>
@@ -647,7 +848,7 @@
     </w:p>
     <w:p>
       <w:pPr>
-        <w:spacing w:after="280"/>
+        <w:spacing w:after="280" w:line="360" w:lineRule="auto"/>
         <w:ind w:firstLine="0"/>
         <w:jc w:val="center"/>
       </w:pPr>
@@ -660,7 +861,7 @@
     </w:p>
     <w:p>
       <w:pPr>
-        <w:spacing w:after="0"/>
+        <w:spacing w:after="0" w:line="360" w:lineRule="auto"/>
         <w:ind w:firstLine="709"/>
         <w:jc w:val="both"/>
       </w:pPr>
@@ -670,7 +871,7 @@
     </w:p>
     <w:p>
       <w:pPr>
-        <w:spacing w:after="0"/>
+        <w:spacing w:after="0" w:line="360" w:lineRule="auto"/>
         <w:ind w:firstLine="709"/>
         <w:jc w:val="both"/>
       </w:pPr>
@@ -680,7 +881,7 @@
     </w:p>
     <w:p>
       <w:pPr>
-        <w:spacing w:after="0"/>
+        <w:spacing w:after="0" w:line="360" w:lineRule="auto"/>
         <w:ind w:firstLine="709"/>
         <w:jc w:val="both"/>
       </w:pPr>
@@ -690,7 +891,7 @@
     </w:p>
     <w:p>
       <w:pPr>
-        <w:spacing w:after="280"/>
+        <w:spacing w:after="280" w:line="360" w:lineRule="auto"/>
         <w:ind w:firstLine="0"/>
         <w:jc w:val="center"/>
       </w:pPr>
@@ -703,7 +904,7 @@
     </w:p>
     <w:p>
       <w:pPr>
-        <w:spacing w:after="280"/>
+        <w:spacing w:after="280" w:line="360" w:lineRule="auto"/>
         <w:ind w:firstLine="0"/>
         <w:jc w:val="center"/>
       </w:pPr>
@@ -716,7 +917,7 @@
     </w:p>
     <w:p>
       <w:pPr>
-        <w:spacing w:after="0"/>
+        <w:spacing w:after="0" w:line="360" w:lineRule="auto"/>
         <w:ind w:firstLine="709"/>
         <w:jc w:val="both"/>
       </w:pPr>
@@ -726,7 +927,7 @@
     </w:p>
     <w:p>
       <w:pPr>
-        <w:spacing w:after="0"/>
+        <w:spacing w:after="0" w:line="360" w:lineRule="auto"/>
         <w:ind w:firstLine="709"/>
         <w:jc w:val="both"/>
       </w:pPr>
@@ -736,7 +937,7 @@
     </w:p>
     <w:p>
       <w:pPr>
-        <w:spacing w:after="0"/>
+        <w:spacing w:after="0" w:line="360" w:lineRule="auto"/>
         <w:ind w:firstLine="709"/>
         <w:jc w:val="both"/>
       </w:pPr>
@@ -746,7 +947,7 @@
     </w:p>
     <w:p>
       <w:pPr>
-        <w:spacing w:after="0"/>
+        <w:spacing w:after="0" w:line="360" w:lineRule="auto"/>
         <w:ind w:firstLine="709"/>
         <w:jc w:val="both"/>
       </w:pPr>
@@ -756,7 +957,7 @@
     </w:p>
     <w:p>
       <w:pPr>
-        <w:spacing w:after="280"/>
+        <w:spacing w:after="280" w:line="360" w:lineRule="auto"/>
         <w:ind w:firstLine="0"/>
         <w:jc w:val="center"/>
       </w:pPr>
@@ -769,7 +970,7 @@
     </w:p>
     <w:p>
       <w:pPr>
-        <w:spacing w:after="0"/>
+        <w:spacing w:after="0" w:line="360" w:lineRule="auto"/>
         <w:ind w:firstLine="709"/>
         <w:jc w:val="both"/>
       </w:pPr>
@@ -779,7 +980,7 @@
     </w:p>
     <w:p>
       <w:pPr>
-        <w:spacing w:after="0"/>
+        <w:spacing w:after="0" w:line="360" w:lineRule="auto"/>
         <w:ind w:firstLine="709"/>
         <w:jc w:val="both"/>
       </w:pPr>
@@ -789,7 +990,7 @@
     </w:p>
     <w:p>
       <w:pPr>
-        <w:spacing w:after="0"/>
+        <w:spacing w:after="0" w:line="360" w:lineRule="auto"/>
         <w:ind w:firstLine="709"/>
         <w:jc w:val="both"/>
       </w:pPr>
@@ -799,7 +1000,7 @@
     </w:p>
     <w:p>
       <w:pPr>
-        <w:spacing w:after="280"/>
+        <w:spacing w:after="280" w:line="360" w:lineRule="auto"/>
         <w:ind w:firstLine="0"/>
         <w:jc w:val="center"/>
       </w:pPr>
@@ -812,7 +1013,7 @@
     </w:p>
     <w:p>
       <w:pPr>
-        <w:spacing w:after="280"/>
+        <w:spacing w:after="280" w:line="360" w:lineRule="auto"/>
         <w:ind w:firstLine="0"/>
         <w:jc w:val="center"/>
       </w:pPr>
@@ -825,7 +1026,7 @@
     </w:p>
     <w:p>
       <w:pPr>
-        <w:spacing w:after="0"/>
+        <w:spacing w:after="0" w:line="360" w:lineRule="auto"/>
         <w:ind w:firstLine="709"/>
         <w:jc w:val="both"/>
       </w:pPr>
@@ -835,7 +1036,7 @@
     </w:p>
     <w:p>
       <w:pPr>
-        <w:spacing w:after="0"/>
+        <w:spacing w:after="0" w:line="360" w:lineRule="auto"/>
         <w:ind w:firstLine="709"/>
         <w:jc w:val="both"/>
       </w:pPr>
@@ -845,7 +1046,7 @@
     </w:p>
     <w:p>
       <w:pPr>
-        <w:spacing w:after="0"/>
+        <w:spacing w:after="0" w:line="360" w:lineRule="auto"/>
         <w:ind w:firstLine="709"/>
         <w:jc w:val="both"/>
       </w:pPr>
@@ -855,7 +1056,7 @@
     </w:p>
     <w:p>
       <w:pPr>
-        <w:spacing w:after="0"/>
+        <w:spacing w:after="0" w:line="360" w:lineRule="auto"/>
         <w:ind w:firstLine="709"/>
         <w:jc w:val="both"/>
       </w:pPr>
@@ -865,7 +1066,7 @@
     </w:p>
     <w:p>
       <w:pPr>
-        <w:spacing w:after="280"/>
+        <w:spacing w:after="280" w:line="360" w:lineRule="auto"/>
         <w:ind w:firstLine="0"/>
         <w:jc w:val="center"/>
       </w:pPr>
@@ -878,7 +1079,7 @@
     </w:p>
     <w:p>
       <w:pPr>
-        <w:spacing w:after="0"/>
+        <w:spacing w:after="0" w:line="360" w:lineRule="auto"/>
         <w:ind w:firstLine="709"/>
         <w:jc w:val="both"/>
       </w:pPr>
@@ -888,7 +1089,7 @@
     </w:p>
     <w:p>
       <w:pPr>
-        <w:spacing w:after="0"/>
+        <w:spacing w:after="0" w:line="360" w:lineRule="auto"/>
         <w:ind w:firstLine="709"/>
         <w:jc w:val="both"/>
       </w:pPr>
@@ -898,7 +1099,7 @@
     </w:p>
     <w:p>
       <w:pPr>
-        <w:spacing w:after="0"/>
+        <w:spacing w:after="0" w:line="360" w:lineRule="auto"/>
         <w:ind w:firstLine="709"/>
         <w:jc w:val="both"/>
       </w:pPr>
@@ -908,7 +1109,7 @@
     </w:p>
     <w:p>
       <w:pPr>
-        <w:spacing w:after="0"/>
+        <w:spacing w:after="0" w:line="360" w:lineRule="auto"/>
         <w:ind w:firstLine="709"/>
         <w:jc w:val="both"/>
       </w:pPr>
@@ -918,7 +1119,7 @@
     </w:p>
     <w:p>
       <w:pPr>
-        <w:spacing w:after="280"/>
+        <w:spacing w:after="280" w:line="360" w:lineRule="auto"/>
         <w:ind w:firstLine="0"/>
         <w:jc w:val="center"/>
       </w:pPr>
@@ -931,7 +1132,7 @@
     </w:p>
     <w:p>
       <w:pPr>
-        <w:spacing w:after="280"/>
+        <w:spacing w:after="280" w:line="360" w:lineRule="auto"/>
         <w:ind w:firstLine="0"/>
         <w:jc w:val="center"/>
       </w:pPr>
@@ -944,7 +1145,7 @@
     </w:p>
     <w:p>
       <w:pPr>
-        <w:spacing w:after="0"/>
+        <w:spacing w:after="0" w:line="360" w:lineRule="auto"/>
         <w:ind w:firstLine="709"/>
         <w:jc w:val="both"/>
       </w:pPr>
@@ -954,7 +1155,7 @@
     </w:p>
     <w:p>
       <w:pPr>
-        <w:spacing w:after="0"/>
+        <w:spacing w:after="0" w:line="360" w:lineRule="auto"/>
         <w:ind w:firstLine="709"/>
         <w:jc w:val="both"/>
       </w:pPr>
@@ -964,7 +1165,7 @@
     </w:p>
     <w:p>
       <w:pPr>
-        <w:spacing w:after="0"/>
+        <w:spacing w:after="0" w:line="360" w:lineRule="auto"/>
         <w:ind w:firstLine="709"/>
         <w:jc w:val="both"/>
       </w:pPr>
@@ -974,7 +1175,7 @@
     </w:p>
     <w:p>
       <w:pPr>
-        <w:spacing w:after="280"/>
+        <w:spacing w:after="280" w:line="360" w:lineRule="auto"/>
         <w:ind w:firstLine="0"/>
         <w:jc w:val="center"/>
       </w:pPr>
@@ -987,7 +1188,7 @@
     </w:p>
     <w:p>
       <w:pPr>
-        <w:spacing w:after="0"/>
+        <w:spacing w:after="0" w:line="360" w:lineRule="auto"/>
         <w:ind w:firstLine="709"/>
         <w:jc w:val="both"/>
       </w:pPr>
@@ -997,7 +1198,7 @@
     </w:p>
     <w:p>
       <w:pPr>
-        <w:spacing w:after="0"/>
+        <w:spacing w:after="0" w:line="360" w:lineRule="auto"/>
         <w:ind w:firstLine="709"/>
         <w:jc w:val="both"/>
       </w:pPr>
@@ -1007,7 +1208,7 @@
     </w:p>
     <w:p>
       <w:pPr>
-        <w:spacing w:after="0"/>
+        <w:spacing w:after="0" w:line="360" w:lineRule="auto"/>
         <w:ind w:firstLine="709"/>
         <w:jc w:val="both"/>
       </w:pPr>
@@ -1017,7 +1218,7 @@
     </w:p>
     <w:p>
       <w:pPr>
-        <w:spacing w:after="280"/>
+        <w:spacing w:after="280" w:line="360" w:lineRule="auto"/>
         <w:ind w:firstLine="0"/>
         <w:jc w:val="center"/>
       </w:pPr>
@@ -1030,7 +1231,7 @@
     </w:p>
     <w:p>
       <w:pPr>
-        <w:spacing w:after="0"/>
+        <w:spacing w:after="0" w:line="360" w:lineRule="auto"/>
         <w:ind w:firstLine="709"/>
         <w:jc w:val="both"/>
       </w:pPr>
@@ -1040,7 +1241,7 @@
     </w:p>
     <w:p>
       <w:pPr>
-        <w:spacing w:after="0"/>
+        <w:spacing w:after="0" w:line="360" w:lineRule="auto"/>
         <w:ind w:firstLine="709"/>
         <w:jc w:val="both"/>
       </w:pPr>
@@ -1050,7 +1251,7 @@
     </w:p>
     <w:p>
       <w:pPr>
-        <w:spacing w:after="0"/>
+        <w:spacing w:after="0" w:line="360" w:lineRule="auto"/>
         <w:ind w:firstLine="709"/>
         <w:jc w:val="both"/>
       </w:pPr>
@@ -1060,7 +1261,7 @@
     </w:p>
     <w:p>
       <w:pPr>
-        <w:spacing w:after="280"/>
+        <w:spacing w:after="280" w:line="360" w:lineRule="auto"/>
         <w:ind w:firstLine="0"/>
         <w:jc w:val="center"/>
       </w:pPr>
@@ -1073,7 +1274,7 @@
     </w:p>
     <w:p>
       <w:pPr>
-        <w:spacing w:after="0"/>
+        <w:spacing w:after="0" w:line="360" w:lineRule="auto"/>
         <w:ind w:firstLine="709"/>
         <w:jc w:val="both"/>
       </w:pPr>
@@ -1083,7 +1284,7 @@
     </w:p>
     <w:p>
       <w:pPr>
-        <w:spacing w:after="0"/>
+        <w:spacing w:after="0" w:line="360" w:lineRule="auto"/>
         <w:ind w:firstLine="709"/>
         <w:jc w:val="both"/>
       </w:pPr>
@@ -1093,7 +1294,7 @@
     </w:p>
     <w:p>
       <w:pPr>
-        <w:spacing w:after="0"/>
+        <w:spacing w:after="0" w:line="360" w:lineRule="auto"/>
         <w:ind w:firstLine="709"/>
         <w:jc w:val="both"/>
       </w:pPr>
@@ -1103,7 +1304,7 @@
     </w:p>
     <w:p>
       <w:pPr>
-        <w:spacing w:after="280"/>
+        <w:spacing w:after="280" w:line="360" w:lineRule="auto"/>
         <w:ind w:firstLine="0"/>
         <w:jc w:val="center"/>
       </w:pPr>
@@ -1116,7 +1317,7 @@
     </w:p>
     <w:p>
       <w:pPr>
-        <w:spacing w:after="0"/>
+        <w:spacing w:after="0" w:line="360" w:lineRule="auto"/>
         <w:ind w:firstLine="709"/>
         <w:jc w:val="both"/>
       </w:pPr>
@@ -1126,7 +1327,7 @@
     </w:p>
     <w:p>
       <w:pPr>
-        <w:spacing w:after="0"/>
+        <w:spacing w:after="0" w:line="360" w:lineRule="auto"/>
         <w:ind w:firstLine="709"/>
         <w:jc w:val="both"/>
       </w:pPr>
@@ -1136,7 +1337,7 @@
     </w:p>
     <w:p>
       <w:pPr>
-        <w:spacing w:after="0"/>
+        <w:spacing w:after="0" w:line="360" w:lineRule="auto"/>
         <w:ind w:firstLine="709"/>
         <w:jc w:val="both"/>
       </w:pPr>
@@ -1146,7 +1347,7 @@
     </w:p>
     <w:p>
       <w:pPr>
-        <w:spacing w:after="280"/>
+        <w:spacing w:after="280" w:line="360" w:lineRule="auto"/>
         <w:ind w:firstLine="0"/>
         <w:jc w:val="center"/>
       </w:pPr>
@@ -1159,7 +1360,7 @@
     </w:p>
     <w:p>
       <w:pPr>
-        <w:spacing w:after="0"/>
+        <w:spacing w:after="0" w:line="360" w:lineRule="auto"/>
         <w:ind w:firstLine="709"/>
         <w:jc w:val="both"/>
       </w:pPr>
@@ -1169,7 +1370,7 @@
     </w:p>
     <w:p>
       <w:pPr>
-        <w:spacing w:after="0"/>
+        <w:spacing w:after="0" w:line="360" w:lineRule="auto"/>
         <w:ind w:firstLine="709"/>
         <w:jc w:val="both"/>
       </w:pPr>
@@ -1179,7 +1380,7 @@
     </w:p>
     <w:p>
       <w:pPr>
-        <w:spacing w:after="0"/>
+        <w:spacing w:after="0" w:line="360" w:lineRule="auto"/>
         <w:ind w:firstLine="709"/>
         <w:jc w:val="both"/>
       </w:pPr>
@@ -1189,7 +1390,7 @@
     </w:p>
     <w:p>
       <w:pPr>
-        <w:spacing w:after="0"/>
+        <w:spacing w:after="0" w:line="360" w:lineRule="auto"/>
         <w:ind w:firstLine="709"/>
         <w:jc w:val="both"/>
       </w:pPr>
@@ -1199,7 +1400,7 @@
     </w:p>
     <w:p>
       <w:pPr>
-        <w:spacing w:after="0"/>
+        <w:spacing w:after="0" w:line="360" w:lineRule="auto"/>
         <w:ind w:firstLine="709"/>
         <w:jc w:val="both"/>
       </w:pPr>
@@ -1209,7 +1410,7 @@
     </w:p>
     <w:p>
       <w:pPr>
-        <w:spacing w:after="0"/>
+        <w:spacing w:after="0" w:line="360" w:lineRule="auto"/>
         <w:ind w:firstLine="709"/>
         <w:jc w:val="both"/>
       </w:pPr>
@@ -1219,7 +1420,7 @@
     </w:p>
     <w:p>
       <w:pPr>
-        <w:spacing w:after="0"/>
+        <w:spacing w:after="0" w:line="360" w:lineRule="auto"/>
         <w:ind w:firstLine="709"/>
         <w:jc w:val="both"/>
       </w:pPr>
@@ -1229,7 +1430,7 @@
     </w:p>
     <w:p>
       <w:pPr>
-        <w:spacing w:after="0"/>
+        <w:spacing w:after="0" w:line="360" w:lineRule="auto"/>
         <w:ind w:firstLine="709"/>
         <w:jc w:val="both"/>
       </w:pPr>

</xml_diff>